<commit_message>
ai ố si ma RAG Chatbot
</commit_message>
<xml_diff>
--- a/docs/Plan.docx
+++ b/docs/Plan.docx
@@ -3110,18 +3110,11 @@
     </w:p>
     <w:p>
       <w:pPr>
-        <w:rPr>
-          <w:rFonts w:ascii="Times New Roman" w:hAnsi="Times New Roman" w:cs="Times New Roman"/>
-        </w:rPr>
-      </w:pPr>
-      <w:r>
-        <w:rPr>
-          <w:rFonts w:ascii="Times New Roman" w:hAnsi="Times New Roman" w:cs="Times New Roman"/>
-        </w:rPr>
-        <w:pict w14:anchorId="6E1C7A28">
-          <v:rect id="_x0000_i1143" style="width:0;height:1.5pt" o:hralign="center" o:hrstd="t" o:hr="t" fillcolor="#a0a0a0" stroked="f"/>
-        </w:pict>
-      </w:r>
+        <w:ind w:left="720"/>
+        <w:rPr>
+          <w:rFonts w:ascii="Times New Roman" w:hAnsi="Times New Roman" w:cs="Times New Roman"/>
+        </w:rPr>
+      </w:pPr>
     </w:p>
     <w:p>
       <w:pPr>
@@ -3137,21 +3130,23 @@
           <w:b/>
           <w:bCs/>
         </w:rPr>
-        <w:t>Nếu mục tiêu là lọt top ở Vietnam AI Innovation Challenge 2026</w:t>
-      </w:r>
-    </w:p>
-    <w:p>
-      <w:pPr>
-        <w:rPr>
-          <w:rFonts w:ascii="Times New Roman" w:hAnsi="Times New Roman" w:cs="Times New Roman"/>
-        </w:rPr>
-      </w:pPr>
-      <w:r>
-        <w:rPr>
-          <w:rFonts w:ascii="Times New Roman" w:hAnsi="Times New Roman" w:cs="Times New Roman"/>
-        </w:rPr>
-        <w:t xml:space="preserve">Ngoài các mục trên, mình khuyên bạn chuẩn bị sẵn một </w:t>
-      </w:r>
+        <w:t>M</w:t>
+      </w:r>
+      <w:r>
+        <w:rPr>
+          <w:rFonts w:ascii="Times New Roman" w:hAnsi="Times New Roman" w:cs="Times New Roman"/>
+          <w:b/>
+          <w:bCs/>
+        </w:rPr>
+        <w:t>ục tiêu là lọt top ở Vietnam AI Innovation Challenge 2026</w:t>
+      </w:r>
+    </w:p>
+    <w:p>
+      <w:pPr>
+        <w:rPr>
+          <w:rFonts w:ascii="Times New Roman" w:hAnsi="Times New Roman" w:cs="Times New Roman"/>
+        </w:rPr>
+      </w:pPr>
       <w:r>
         <w:rPr>
           <w:rFonts w:ascii="Times New Roman" w:hAnsi="Times New Roman" w:cs="Times New Roman"/>

</xml_diff>